<commit_message>
sửa bài thực hành 3
</commit_message>
<xml_diff>
--- a/SS8/BTTH3/BTTH3.docx
+++ b/SS8/BTTH3/BTTH3.docx
@@ -471,6 +471,24 @@
       </w:tr>
     </w:tbl>
     <w:p/>
+    <w:p>
+      <w:pPr>
+        <w:numPr>
+          <w:ilvl w:val="0"/>
+          <w:numId w:val="2"/>
+        </w:numPr>
+      </w:pPr>
+      <w:r>
+        <w:t>Quan hệ Composition thể hiện sự gắn kết chặt chẽ về vòng đời dữ liệu, đối tượng thành phần</w:t>
+      </w:r>
+      <w:r>
+        <w:t xml:space="preserve"> </w:t>
+      </w:r>
+      <w:r>
+        <w:t>sẽ bị hủy diệt nếu đối tượng tổng thể không còn tồn tại. Ngược lại, quan hệ Dependency chỉ là sự sử dụng dịch vụ tạm thời trong một phương thức, hai đối tượng có vòng đời hoàn toàn độc lập với nhau.</w:t>
+      </w:r>
+    </w:p>
+    <w:p/>
     <w:sectPr>
       <w:pgSz w:w="12240" w:h="15840"/>
       <w:pgMar w:top="1440" w:right="1440" w:bottom="1440" w:left="1440" w:header="709" w:footer="709" w:gutter="0"/>
@@ -484,6 +502,155 @@
 <file path=word/numbering.xml><?xml version="1.0" encoding="utf-8"?>
 <w:numbering xmlns:wpc="http://schemas.microsoft.com/office/word/2010/wordprocessingCanvas" xmlns:cx="http://schemas.microsoft.com/office/drawing/2014/chartex" xmlns:cx1="http://schemas.microsoft.com/office/drawing/2015/9/8/chartex" xmlns:cx2="http://schemas.microsoft.com/office/drawing/2015/10/21/chartex" xmlns:cx3="http://schemas.microsoft.com/office/drawing/2016/5/9/chartex" xmlns:cx4="http://schemas.microsoft.com/office/drawing/2016/5/10/chartex" xmlns:cx5="http://schemas.microsoft.com/office/drawing/2016/5/11/chartex" xmlns:cx6="http://schemas.microsoft.com/office/drawing/2016/5/12/chartex" xmlns:cx7="http://schemas.microsoft.com/office/drawing/2016/5/13/chartex" xmlns:cx8="http://schemas.microsoft.com/office/drawing/2016/5/14/chartex" xmlns:mc="http://schemas.openxmlformats.org/markup-compatibility/2006" xmlns:aink="http://schemas.microsoft.com/office/drawing/2016/ink" xmlns:am3d="http://schemas.microsoft.com/office/drawing/2017/model3d" xmlns:o="urn:schemas-microsoft-com:office:office" xmlns:oel="http://schemas.microsoft.com/office/2019/extlst" xmlns:r="http://schemas.openxmlformats.org/officeDocument/2006/relationships" xmlns:m="http://schemas.openxmlformats.org/officeDocument/2006/math" xmlns:v="urn:schemas-microsoft-com:vml" xmlns:wp14="http://schemas.microsoft.com/office/word/2010/wordprocessingDrawing" xmlns:wp="http://schemas.openxmlformats.org/drawingml/2006/wordprocessingDrawing" xmlns:w10="urn:schemas-microsoft-com:office:word" xmlns:w="http://schemas.openxmlformats.org/wordprocessingml/2006/main" xmlns:w14="http://schemas.microsoft.com/office/word/2010/wordml" xmlns:w15="http://schemas.microsoft.com/office/word/2012/wordml" xmlns:w16cex="http://schemas.microsoft.com/office/word/2018/wordml/cex" xmlns:w16cid="http://schemas.microsoft.com/office/word/2016/wordml/cid" xmlns:w16="http://schemas.microsoft.com/office/word/2018/wordml" xmlns:w16du="http://schemas.microsoft.com/office/word/2023/wordml/word16du" xmlns:w16sdtdh="http://schemas.microsoft.com/office/word/2020/wordml/sdtdatahash" xmlns:w16sdtfl="http://schemas.microsoft.com/office/word/2024/wordml/sdtformatlock" xmlns:w16se="http://schemas.microsoft.com/office/word/2015/wordml/symex" xmlns:wpg="http://schemas.microsoft.com/office/word/2010/wordprocessingGroup" xmlns:wpi="http://schemas.microsoft.com/office/word/2010/wordprocessingInk" xmlns:wne="http://schemas.microsoft.com/office/word/2006/wordml" xmlns:wps="http://schemas.microsoft.com/office/word/2010/wordprocessingShape" mc:Ignorable="w14 w15 w16se w16cid w16 w16cex w16sdtdh w16sdtfl w16du wp14">
   <w:abstractNum w:abstractNumId="0" w15:restartNumberingAfterBreak="0">
+    <w:nsid w:val="40566B55"/>
+    <w:multiLevelType w:val="multilevel"/>
+    <w:tmpl w:val="F918CA6C"/>
+    <w:lvl w:ilvl="0">
+      <w:start w:val="1"/>
+      <w:numFmt w:val="bullet"/>
+      <w:lvlText w:val=""/>
+      <w:lvlJc w:val="left"/>
+      <w:pPr>
+        <w:tabs>
+          <w:tab w:val="num" w:pos="720"/>
+        </w:tabs>
+        <w:ind w:left="720" w:hanging="360"/>
+      </w:pPr>
+      <w:rPr>
+        <w:rFonts w:ascii="Symbol" w:hAnsi="Symbol" w:hint="default"/>
+        <w:sz w:val="20"/>
+      </w:rPr>
+    </w:lvl>
+    <w:lvl w:ilvl="1" w:tentative="1">
+      <w:start w:val="1"/>
+      <w:numFmt w:val="bullet"/>
+      <w:lvlText w:val="o"/>
+      <w:lvlJc w:val="left"/>
+      <w:pPr>
+        <w:tabs>
+          <w:tab w:val="num" w:pos="1440"/>
+        </w:tabs>
+        <w:ind w:left="1440" w:hanging="360"/>
+      </w:pPr>
+      <w:rPr>
+        <w:rFonts w:ascii="Courier New" w:hAnsi="Courier New" w:hint="default"/>
+        <w:sz w:val="20"/>
+      </w:rPr>
+    </w:lvl>
+    <w:lvl w:ilvl="2" w:tentative="1">
+      <w:start w:val="1"/>
+      <w:numFmt w:val="bullet"/>
+      <w:lvlText w:val=""/>
+      <w:lvlJc w:val="left"/>
+      <w:pPr>
+        <w:tabs>
+          <w:tab w:val="num" w:pos="2160"/>
+        </w:tabs>
+        <w:ind w:left="2160" w:hanging="360"/>
+      </w:pPr>
+      <w:rPr>
+        <w:rFonts w:ascii="Wingdings" w:hAnsi="Wingdings" w:hint="default"/>
+        <w:sz w:val="20"/>
+      </w:rPr>
+    </w:lvl>
+    <w:lvl w:ilvl="3" w:tentative="1">
+      <w:start w:val="1"/>
+      <w:numFmt w:val="bullet"/>
+      <w:lvlText w:val=""/>
+      <w:lvlJc w:val="left"/>
+      <w:pPr>
+        <w:tabs>
+          <w:tab w:val="num" w:pos="2880"/>
+        </w:tabs>
+        <w:ind w:left="2880" w:hanging="360"/>
+      </w:pPr>
+      <w:rPr>
+        <w:rFonts w:ascii="Wingdings" w:hAnsi="Wingdings" w:hint="default"/>
+        <w:sz w:val="20"/>
+      </w:rPr>
+    </w:lvl>
+    <w:lvl w:ilvl="4" w:tentative="1">
+      <w:start w:val="1"/>
+      <w:numFmt w:val="bullet"/>
+      <w:lvlText w:val=""/>
+      <w:lvlJc w:val="left"/>
+      <w:pPr>
+        <w:tabs>
+          <w:tab w:val="num" w:pos="3600"/>
+        </w:tabs>
+        <w:ind w:left="3600" w:hanging="360"/>
+      </w:pPr>
+      <w:rPr>
+        <w:rFonts w:ascii="Wingdings" w:hAnsi="Wingdings" w:hint="default"/>
+        <w:sz w:val="20"/>
+      </w:rPr>
+    </w:lvl>
+    <w:lvl w:ilvl="5" w:tentative="1">
+      <w:start w:val="1"/>
+      <w:numFmt w:val="bullet"/>
+      <w:lvlText w:val=""/>
+      <w:lvlJc w:val="left"/>
+      <w:pPr>
+        <w:tabs>
+          <w:tab w:val="num" w:pos="4320"/>
+        </w:tabs>
+        <w:ind w:left="4320" w:hanging="360"/>
+      </w:pPr>
+      <w:rPr>
+        <w:rFonts w:ascii="Wingdings" w:hAnsi="Wingdings" w:hint="default"/>
+        <w:sz w:val="20"/>
+      </w:rPr>
+    </w:lvl>
+    <w:lvl w:ilvl="6" w:tentative="1">
+      <w:start w:val="1"/>
+      <w:numFmt w:val="bullet"/>
+      <w:lvlText w:val=""/>
+      <w:lvlJc w:val="left"/>
+      <w:pPr>
+        <w:tabs>
+          <w:tab w:val="num" w:pos="5040"/>
+        </w:tabs>
+        <w:ind w:left="5040" w:hanging="360"/>
+      </w:pPr>
+      <w:rPr>
+        <w:rFonts w:ascii="Wingdings" w:hAnsi="Wingdings" w:hint="default"/>
+        <w:sz w:val="20"/>
+      </w:rPr>
+    </w:lvl>
+    <w:lvl w:ilvl="7" w:tentative="1">
+      <w:start w:val="1"/>
+      <w:numFmt w:val="bullet"/>
+      <w:lvlText w:val=""/>
+      <w:lvlJc w:val="left"/>
+      <w:pPr>
+        <w:tabs>
+          <w:tab w:val="num" w:pos="5760"/>
+        </w:tabs>
+        <w:ind w:left="5760" w:hanging="360"/>
+      </w:pPr>
+      <w:rPr>
+        <w:rFonts w:ascii="Wingdings" w:hAnsi="Wingdings" w:hint="default"/>
+        <w:sz w:val="20"/>
+      </w:rPr>
+    </w:lvl>
+    <w:lvl w:ilvl="8" w:tentative="1">
+      <w:start w:val="1"/>
+      <w:numFmt w:val="bullet"/>
+      <w:lvlText w:val=""/>
+      <w:lvlJc w:val="left"/>
+      <w:pPr>
+        <w:tabs>
+          <w:tab w:val="num" w:pos="6480"/>
+        </w:tabs>
+        <w:ind w:left="6480" w:hanging="360"/>
+      </w:pPr>
+      <w:rPr>
+        <w:rFonts w:ascii="Wingdings" w:hAnsi="Wingdings" w:hint="default"/>
+        <w:sz w:val="20"/>
+      </w:rPr>
+    </w:lvl>
+  </w:abstractNum>
+  <w:abstractNum w:abstractNumId="1" w15:restartNumberingAfterBreak="0">
     <w:nsid w:val="45C71665"/>
     <w:multiLevelType w:val="multilevel"/>
     <w:tmpl w:val="C8480F38"/>
@@ -633,6 +800,9 @@
     </w:lvl>
   </w:abstractNum>
   <w:num w:numId="1" w16cid:durableId="227423507">
+    <w:abstractNumId w:val="1"/>
+  </w:num>
+  <w:num w:numId="2" w16cid:durableId="504125805">
     <w:abstractNumId w:val="0"/>
   </w:num>
 </w:numbering>

</xml_diff>